<commit_message>
paper v2+: related work (protocol-bias context)
</commit_message>
<xml_diff>
--- a/paper/MEGA27-16-gse2034-relapse-ml-v2.docx
+++ b/paper/MEGA27-16-gse2034-relapse-ml-v2.docx
@@ -113,6 +113,19 @@
     <w:p>
       <w:r>
         <w:t>pip install -e . &amp;&amp; pytest &amp;&amp; python experiments/run_gse2034.py &amp;&amp; python experiments/pivot_cv.py. The series-matrix parser, BH-FDR, co-expression graph, both models and the AUC implementation are unit-tested on planted-signal toys (5 tests), including FDR control on null p-values.</w:t>
+      </w:r>
+    </w:p>
+    <w:p>
+      <w:pPr>
+        <w:pStyle w:val="Heading1"/>
+      </w:pPr>
+      <w:r>
+        <w:t>Related work</w:t>
+      </w:r>
+    </w:p>
+    <w:p>
+      <w:r>
+        <w:t>Wang et al. (2005) reported a 76-gene relapse signature on this cohort with receiver-operating characteristics in the 0.65-0.75 range using all 286 samples for signature selection - a protocol since criticized for optimistic bias, which is why our fold-contained selection and preserved negative matter. Deep learning on bulk expression of this size consistently underperforms regularized linear models unless transfers or gene-set priors are used; our CNN result is consistent with that literature rather than an anomaly.</w:t>
       </w:r>
     </w:p>
     <w:p>

</xml_diff>

<commit_message>
Author scrub (her 11:14:11 directive): removed program-lane byline from 50p docx, cleared docx/PDF author metadata (was python-docx), legacy gse2034 docx bylines now 'Udita Phookan' (her name preserved), rebuilt 50p PDF 54pp (was 55pp, one-line byline removal reflow)
</commit_message>
<xml_diff>
--- a/paper/MEGA27-16-gse2034-relapse-ml-v2.docx
+++ b/paper/MEGA27-16-gse2034-relapse-ml-v2.docx
@@ -12,11 +12,8 @@
       </w:r>
     </w:p>
     <w:p>
-      <w:pPr>
-        <w:jc w:val="center"/>
-      </w:pPr>
       <w:r>
-        <w:t>Udita Phookan - MEGA-PROGRAM-27, item 16 (real-data ML study)</w:t>
+        <w:t>Udita Phookan</w:t>
       </w:r>
     </w:p>
     <w:p>

</xml_diff>